<commit_message>
chore: documentar memorias y trabajo escrito(punto 3 y 4)
</commit_message>
<xml_diff>
--- a/Docu_TFG/Plantilla memoria escrita.docx
+++ b/Docu_TFG/Plantilla memoria escrita.docx
@@ -3155,21 +3155,7 @@
         <w:rPr>
           <w:lang w:val="es-ES"/>
         </w:rPr>
-        <w:t xml:space="preserve">Es por eso </w:t>
-      </w:r>
-      <w:proofErr w:type="gramStart"/>
-      <w:r>
-        <w:rPr>
-          <w:lang w:val="es-ES"/>
-        </w:rPr>
-        <w:t>que</w:t>
-      </w:r>
-      <w:proofErr w:type="gramEnd"/>
-      <w:r>
-        <w:rPr>
-          <w:lang w:val="es-ES"/>
-        </w:rPr>
-        <w:t xml:space="preserve"> he pensado en una forma de conectar con las personas que te rodean, que tienen un gran conocimiento por compartir y además quieren formar vínculos con la comunidad que les rodea. Creo una comunidad tiene la oportunidad de brindarse apoyo mutuo y poder compartir lazos con esas personas nos puede acercar un poco a no estar tan cerca y a la vez tan desconectados. </w:t>
+        <w:t xml:space="preserve">Es por eso que he pensado en una forma de conectar con las personas que te rodean, que tienen un gran conocimiento por compartir y además quieren formar vínculos con la comunidad que les rodea. Creo una comunidad tiene la oportunidad de brindarse apoyo mutuo y poder compartir lazos con esas personas nos puede acercar un poco a no estar tan cerca y a la vez tan desconectados. </w:t>
       </w:r>
     </w:p>
     <w:p>
@@ -3429,21 +3415,7 @@
         <w:rPr>
           <w:lang w:val="en-US"/>
         </w:rPr>
-        <w:t xml:space="preserve">lder </w:t>
-      </w:r>
-      <w:proofErr w:type="gramStart"/>
-      <w:r>
-        <w:rPr>
-          <w:lang w:val="en-US"/>
-        </w:rPr>
-        <w:t>people</w:t>
-      </w:r>
-      <w:proofErr w:type="gramEnd"/>
-      <w:r>
-        <w:rPr>
-          <w:lang w:val="en-US"/>
-        </w:rPr>
-        <w:t xml:space="preserve"> companionship, administrative assistance ... </w:t>
+        <w:t xml:space="preserve">lder people companionship, administrative assistance ... </w:t>
       </w:r>
       <w:r>
         <w:rPr>
@@ -5169,21 +5141,7 @@
           <w:lang w:val="es-ES"/>
         </w:rPr>
         <w:lastRenderedPageBreak/>
-        <w:t xml:space="preserve">usuario moderna, dejando un vacío para una </w:t>
-      </w:r>
-      <w:proofErr w:type="gramStart"/>
-      <w:r>
-        <w:rPr>
-          <w:lang w:val="es-ES"/>
-        </w:rPr>
-        <w:t>app</w:t>
-      </w:r>
-      <w:proofErr w:type="gramEnd"/>
-      <w:r>
-        <w:rPr>
-          <w:lang w:val="es-ES"/>
-        </w:rPr>
-        <w:t xml:space="preserve"> </w:t>
+        <w:t xml:space="preserve">usuario moderna, dejando un vacío para una app </w:t>
       </w:r>
       <w:r>
         <w:rPr>
@@ -6251,21 +6209,7 @@
         <w:rPr>
           <w:lang w:val="es-ES"/>
         </w:rPr>
-        <w:t xml:space="preserve"> (el lector de pantalla del sistema</w:t>
-      </w:r>
-      <w:proofErr w:type="gramStart"/>
-      <w:r>
-        <w:rPr>
-          <w:lang w:val="es-ES"/>
-        </w:rPr>
-        <w:t>),VecindApp</w:t>
-      </w:r>
-      <w:proofErr w:type="gramEnd"/>
-      <w:r>
-        <w:rPr>
-          <w:lang w:val="es-ES"/>
-        </w:rPr>
-        <w:t xml:space="preserve"> integrará un botón de lectura en voz alta dentro de la propia interfaz mediante la API </w:t>
+        <w:t xml:space="preserve"> (el lector de pantalla del sistema),VecindApp integrará un botón de lectura en voz alta dentro de la propia interfaz mediante la API </w:t>
       </w:r>
       <w:proofErr w:type="spellStart"/>
       <w:r>
@@ -6525,53 +6469,21 @@
           <w:szCs w:val="22"/>
           <w:lang w:val="es-ES"/>
         </w:rPr>
-        <w:t xml:space="preserve">Nota: Existe </w:t>
-      </w:r>
-      <w:proofErr w:type="gramStart"/>
+        <w:t>Nota: Existe una startup colombiano llamada “Vecindapp” (</w:t>
+      </w:r>
       <w:r>
         <w:rPr>
           <w:szCs w:val="22"/>
           <w:lang w:val="es-ES"/>
         </w:rPr>
-        <w:t>una startup colombiano</w:t>
-      </w:r>
-      <w:proofErr w:type="gramEnd"/>
+        <w:t>https://vecindapp.com.co/</w:t>
+      </w:r>
       <w:r>
         <w:rPr>
           <w:szCs w:val="22"/>
           <w:lang w:val="es-ES"/>
         </w:rPr>
-        <w:t xml:space="preserve"> llamada “Vecindapp” (</w:t>
-      </w:r>
-      <w:r>
-        <w:rPr>
-          <w:szCs w:val="22"/>
-          <w:lang w:val="es-ES"/>
-        </w:rPr>
-        <w:t>https://vecindapp.com.co/</w:t>
-      </w:r>
-      <w:r>
-        <w:rPr>
-          <w:szCs w:val="22"/>
-          <w:lang w:val="es-ES"/>
-        </w:rPr>
-        <w:t xml:space="preserve">), pero se trata de una </w:t>
-      </w:r>
-      <w:proofErr w:type="gramStart"/>
-      <w:r>
-        <w:rPr>
-          <w:szCs w:val="22"/>
-          <w:lang w:val="es-ES"/>
-        </w:rPr>
-        <w:t>app</w:t>
-      </w:r>
-      <w:proofErr w:type="gramEnd"/>
-      <w:r>
-        <w:rPr>
-          <w:szCs w:val="22"/>
-          <w:lang w:val="es-ES"/>
-        </w:rPr>
-        <w:t xml:space="preserve"> de administración de </w:t>
+        <w:t xml:space="preserve">), pero se trata de una app de administración de </w:t>
       </w:r>
       <w:r>
         <w:rPr>
@@ -7828,21 +7740,12 @@
                 <w:lang w:val="es-ES"/>
               </w:rPr>
             </w:pPr>
-            <w:proofErr w:type="gramStart"/>
-            <w:r>
-              <w:rPr>
-                <w:szCs w:val="22"/>
-                <w:lang w:val="es-ES"/>
-              </w:rPr>
-              <w:t>API nativa</w:t>
-            </w:r>
-            <w:proofErr w:type="gramEnd"/>
-            <w:r>
-              <w:rPr>
-                <w:szCs w:val="22"/>
-                <w:lang w:val="es-ES"/>
-              </w:rPr>
-              <w:t xml:space="preserve"> de Android para síntesis de voz. No </w:t>
+            <w:r>
+              <w:rPr>
+                <w:szCs w:val="22"/>
+                <w:lang w:val="es-ES"/>
+              </w:rPr>
+              <w:t xml:space="preserve">API nativa de Android para síntesis de voz. No </w:t>
             </w:r>
           </w:p>
           <w:p>
@@ -7889,14 +7792,243 @@
           <w:lang w:val="es-ES"/>
         </w:rPr>
       </w:pPr>
-    </w:p>
-    <w:p>
-      <w:pPr>
+      <w:r>
         <w:rPr>
           <w:szCs w:val="22"/>
           <w:lang w:val="es-ES"/>
         </w:rPr>
-      </w:pPr>
+        <w:t>Queda por aclarar</w:t>
+      </w:r>
+      <w:r>
+        <w:rPr>
+          <w:szCs w:val="22"/>
+          <w:lang w:val="es-ES"/>
+        </w:rPr>
+        <w:t xml:space="preserve"> por qué el proyecto no utiliza ciertas librerías que forman parte del </w:t>
+      </w:r>
+      <w:proofErr w:type="spellStart"/>
+      <w:r>
+        <w:rPr>
+          <w:szCs w:val="22"/>
+          <w:lang w:val="es-ES"/>
+        </w:rPr>
+        <w:t>stack</w:t>
+      </w:r>
+      <w:proofErr w:type="spellEnd"/>
+      <w:r>
+        <w:rPr>
+          <w:szCs w:val="22"/>
+          <w:lang w:val="es-ES"/>
+        </w:rPr>
+        <w:t xml:space="preserve"> habitual en proyectos Android profesionales, como Hilt/Dagger para inyección de dependencias, </w:t>
+      </w:r>
+      <w:proofErr w:type="spellStart"/>
+      <w:r>
+        <w:rPr>
+          <w:szCs w:val="22"/>
+          <w:lang w:val="es-ES"/>
+        </w:rPr>
+        <w:t>Retrofit</w:t>
+      </w:r>
+      <w:proofErr w:type="spellEnd"/>
+      <w:r>
+        <w:rPr>
+          <w:szCs w:val="22"/>
+          <w:lang w:val="es-ES"/>
+        </w:rPr>
+        <w:t xml:space="preserve"> para comunicación con </w:t>
+      </w:r>
+      <w:proofErr w:type="spellStart"/>
+      <w:r>
+        <w:rPr>
+          <w:szCs w:val="22"/>
+          <w:lang w:val="es-ES"/>
+        </w:rPr>
+        <w:t>APIs</w:t>
+      </w:r>
+      <w:proofErr w:type="spellEnd"/>
+      <w:r>
+        <w:rPr>
+          <w:szCs w:val="22"/>
+          <w:lang w:val="es-ES"/>
+        </w:rPr>
+        <w:t xml:space="preserve"> REST o </w:t>
+      </w:r>
+      <w:proofErr w:type="spellStart"/>
+      <w:r>
+        <w:rPr>
+          <w:szCs w:val="22"/>
+          <w:lang w:val="es-ES"/>
+        </w:rPr>
+        <w:t>Glide</w:t>
+      </w:r>
+      <w:proofErr w:type="spellEnd"/>
+      <w:r>
+        <w:rPr>
+          <w:szCs w:val="22"/>
+          <w:lang w:val="es-ES"/>
+        </w:rPr>
+        <w:t xml:space="preserve"> para carga de imágenes.</w:t>
+      </w:r>
+    </w:p>
+    <w:p>
+      <w:pPr>
+        <w:rPr>
+          <w:szCs w:val="22"/>
+          <w:lang w:val="es-ES"/>
+        </w:rPr>
+      </w:pPr>
+      <w:r>
+        <w:rPr>
+          <w:szCs w:val="22"/>
+          <w:lang w:val="es-ES"/>
+        </w:rPr>
+        <w:lastRenderedPageBreak/>
+        <w:t>En primer lugar, VecindApp es una aplicación offline-</w:t>
+      </w:r>
+      <w:proofErr w:type="spellStart"/>
+      <w:r>
+        <w:rPr>
+          <w:szCs w:val="22"/>
+          <w:lang w:val="es-ES"/>
+        </w:rPr>
+        <w:t>first</w:t>
+      </w:r>
+      <w:proofErr w:type="spellEnd"/>
+      <w:r>
+        <w:rPr>
+          <w:szCs w:val="22"/>
+          <w:lang w:val="es-ES"/>
+        </w:rPr>
+        <w:t xml:space="preserve"> cuya totalidad de datos reside en una base de datos local SQLite gestionada con Room. No existe un servidor remoto ni una API REST con la que comunicarse, por lo que </w:t>
+      </w:r>
+      <w:proofErr w:type="spellStart"/>
+      <w:r>
+        <w:rPr>
+          <w:szCs w:val="22"/>
+          <w:lang w:val="es-ES"/>
+        </w:rPr>
+        <w:t>Retrofit</w:t>
+      </w:r>
+      <w:proofErr w:type="spellEnd"/>
+      <w:r>
+        <w:rPr>
+          <w:szCs w:val="22"/>
+          <w:lang w:val="es-ES"/>
+        </w:rPr>
+        <w:t xml:space="preserve"> carece de propósito en este proyecto. Del mismo modo, todas las imágenes utilizadas (pictogramas ARASAAC e iconos de categoría) están empaquetadas como </w:t>
+      </w:r>
+      <w:proofErr w:type="spellStart"/>
+      <w:r>
+        <w:rPr>
+          <w:szCs w:val="22"/>
+          <w:lang w:val="es-ES"/>
+        </w:rPr>
+        <w:t>assets</w:t>
+      </w:r>
+      <w:proofErr w:type="spellEnd"/>
+      <w:r>
+        <w:rPr>
+          <w:szCs w:val="22"/>
+          <w:lang w:val="es-ES"/>
+        </w:rPr>
+        <w:t xml:space="preserve"> locales en la carpeta /</w:t>
+      </w:r>
+      <w:proofErr w:type="spellStart"/>
+      <w:r>
+        <w:rPr>
+          <w:szCs w:val="22"/>
+          <w:lang w:val="es-ES"/>
+        </w:rPr>
+        <w:t>res</w:t>
+      </w:r>
+      <w:proofErr w:type="spellEnd"/>
+      <w:r>
+        <w:rPr>
+          <w:szCs w:val="22"/>
+          <w:lang w:val="es-ES"/>
+        </w:rPr>
+        <w:t>/</w:t>
+      </w:r>
+      <w:proofErr w:type="spellStart"/>
+      <w:r>
+        <w:rPr>
+          <w:szCs w:val="22"/>
+          <w:lang w:val="es-ES"/>
+        </w:rPr>
+        <w:t>drawable</w:t>
+      </w:r>
+      <w:proofErr w:type="spellEnd"/>
+      <w:r>
+        <w:rPr>
+          <w:szCs w:val="22"/>
+          <w:lang w:val="es-ES"/>
+        </w:rPr>
+        <w:t xml:space="preserve">, lo que hace innecesaria una librería de carga de imágenes remotas como </w:t>
+      </w:r>
+      <w:proofErr w:type="spellStart"/>
+      <w:r>
+        <w:rPr>
+          <w:szCs w:val="22"/>
+          <w:lang w:val="es-ES"/>
+        </w:rPr>
+        <w:t>Glide</w:t>
+      </w:r>
+      <w:proofErr w:type="spellEnd"/>
+      <w:r>
+        <w:rPr>
+          <w:szCs w:val="22"/>
+          <w:lang w:val="es-ES"/>
+        </w:rPr>
+        <w:t>.</w:t>
+      </w:r>
+    </w:p>
+    <w:p>
+      <w:pPr>
+        <w:rPr>
+          <w:szCs w:val="22"/>
+          <w:lang w:val="es-ES"/>
+        </w:rPr>
+      </w:pPr>
+      <w:r>
+        <w:rPr>
+          <w:szCs w:val="22"/>
+          <w:lang w:val="es-ES"/>
+        </w:rPr>
+        <w:t xml:space="preserve">En cuanto a la inyección de dependencias, se optó por una inyección manual a través de la clase </w:t>
+      </w:r>
+      <w:proofErr w:type="spellStart"/>
+      <w:r>
+        <w:rPr>
+          <w:szCs w:val="22"/>
+          <w:lang w:val="es-ES"/>
+        </w:rPr>
+        <w:t>VecindAppApplication</w:t>
+      </w:r>
+      <w:proofErr w:type="spellEnd"/>
+      <w:r>
+        <w:rPr>
+          <w:szCs w:val="22"/>
+          <w:lang w:val="es-ES"/>
+        </w:rPr>
+        <w:t xml:space="preserve">, que actúa como contenedor Singleton proporcionando la instancia de la base de datos y los cuatro repositorios. Esta decisión responde a dos motivos: por un lado, Hilt y Dagger son </w:t>
+      </w:r>
+      <w:proofErr w:type="spellStart"/>
+      <w:r>
+        <w:rPr>
+          <w:szCs w:val="22"/>
+          <w:lang w:val="es-ES"/>
+        </w:rPr>
+        <w:t>frameworks</w:t>
+      </w:r>
+      <w:proofErr w:type="spellEnd"/>
+      <w:r>
+        <w:rPr>
+          <w:szCs w:val="22"/>
+          <w:lang w:val="es-ES"/>
+        </w:rPr>
+        <w:t xml:space="preserve"> de terceros que no se han trabajado durante el CFGS y cuyo uso requiere justificación en la propuesta; por otro, la envergadura del proyecto (4 repositorios, sin módulos Gradle adicionales) no justifica la complejidad añadida que introducen estas librerías. La solución manual implementada cumple el mismo objetivo (evitar instancias duplicadas de la base de datos, respetar el patrón Singleton) con una fracción del código de configuración. Para un proyecto de mayor envergadura o en un entorno de producción con múltiples módulos, la migración a Hilt sería el siguiente paso lógico y se contempla como vía futura.</w:t>
+      </w:r>
     </w:p>
     <w:p>
       <w:pPr>
@@ -7914,7 +8046,6 @@
         <w:rPr>
           <w:lang w:val="es-ES"/>
         </w:rPr>
-        <w:lastRenderedPageBreak/>
         <w:t>Tecnologías de terceros</w:t>
       </w:r>
       <w:bookmarkEnd w:id="14"/>
@@ -8071,23 +8202,7 @@
                 <w:szCs w:val="22"/>
                 <w:lang w:val="es-ES"/>
               </w:rPr>
-              <w:t xml:space="preserve"> locales en la </w:t>
-            </w:r>
-            <w:proofErr w:type="gramStart"/>
-            <w:r>
-              <w:rPr>
-                <w:szCs w:val="22"/>
-                <w:lang w:val="es-ES"/>
-              </w:rPr>
-              <w:t>app</w:t>
-            </w:r>
-            <w:proofErr w:type="gramEnd"/>
-            <w:r>
-              <w:rPr>
-                <w:szCs w:val="22"/>
-                <w:lang w:val="es-ES"/>
-              </w:rPr>
-              <w:t>. Estándar nacional en accesibilidad cognitiva con licencia Creative Commons BY-NC-SA. Utilizados para el sistema de valoraciones que sustituye las clásicas estrellas numéricas</w:t>
+              <w:t xml:space="preserve"> locales en la app. Estándar nacional en accesibilidad cognitiva con licencia Creative Commons BY-NC-SA. Utilizados para el sistema de valoraciones que sustituye las clásicas estrellas numéricas</w:t>
             </w:r>
           </w:p>
         </w:tc>
@@ -8235,6 +8350,7 @@
           <w:szCs w:val="22"/>
           <w:lang w:val="es-ES"/>
         </w:rPr>
+        <w:lastRenderedPageBreak/>
         <w:t>Tabla 3. Tecnologías de terceros. Elaboración propia.</w:t>
       </w:r>
     </w:p>
@@ -8438,42 +8554,6 @@
     <w:p>
       <w:pPr>
         <w:rPr>
-          <w:lang w:val="es-ES"/>
-        </w:rPr>
-      </w:pPr>
-    </w:p>
-    <w:p>
-      <w:pPr>
-        <w:rPr>
-          <w:lang w:val="es-ES"/>
-        </w:rPr>
-      </w:pPr>
-    </w:p>
-    <w:p>
-      <w:pPr>
-        <w:rPr>
-          <w:lang w:val="es-ES"/>
-        </w:rPr>
-      </w:pPr>
-    </w:p>
-    <w:p>
-      <w:pPr>
-        <w:rPr>
-          <w:lang w:val="es-ES"/>
-        </w:rPr>
-      </w:pPr>
-    </w:p>
-    <w:p>
-      <w:pPr>
-        <w:rPr>
-          <w:szCs w:val="22"/>
-          <w:lang w:val="es-ES"/>
-        </w:rPr>
-      </w:pPr>
-    </w:p>
-    <w:p>
-      <w:pPr>
-        <w:rPr>
           <w:szCs w:val="22"/>
           <w:lang w:val="es-ES"/>
         </w:rPr>
@@ -8495,7 +8575,10 @@
       <w:bookmarkStart w:id="16" w:name="_Toc224534500"/>
       <w:r>
         <w:lastRenderedPageBreak/>
-        <w:t>Planificación, Diagnóstico y Contexto Laboral</w:t>
+        <w:t>Planificación</w:t>
+      </w:r>
+      <w:r>
+        <w:t>, Diagnóstico y Contexto Laboral</w:t>
       </w:r>
       <w:bookmarkEnd w:id="16"/>
       <w:r>
@@ -8505,6 +8588,168 @@
     <w:p>
       <w:r>
         <w:t>(3-4 páginas)</w:t>
+      </w:r>
+    </w:p>
+    <w:p>
+      <w:pPr>
+        <w:rPr>
+          <w:lang w:val="es-ES"/>
+        </w:rPr>
+      </w:pPr>
+      <w:r>
+        <w:rPr>
+          <w:b/>
+          <w:bCs/>
+          <w:lang w:val="es-ES"/>
+        </w:rPr>
+        <w:t>Contexto laboral</w:t>
+      </w:r>
+    </w:p>
+    <w:p>
+      <w:pPr>
+        <w:rPr>
+          <w:lang w:val="es-ES"/>
+        </w:rPr>
+      </w:pPr>
+      <w:r>
+        <w:rPr>
+          <w:lang w:val="es-ES"/>
+        </w:rPr>
+        <w:t xml:space="preserve">Este proyecto se ha desarrollado compaginando el CFGS de Desarrollo de Aplicaciones Multiplataforma con una jornada laboral completa. Esto ha condicionado la planificación de dos maneras: por un lado, las sesiones de desarrollo se repartían entre horas previas a la jornada laboral, pausas y tardes/noches; por otro, el entorno corporativo del puesto de trabajo (firewall </w:t>
+      </w:r>
+      <w:proofErr w:type="spellStart"/>
+      <w:r>
+        <w:rPr>
+          <w:lang w:val="es-ES"/>
+        </w:rPr>
+        <w:t>Zscaler</w:t>
+      </w:r>
+      <w:proofErr w:type="spellEnd"/>
+      <w:r>
+        <w:rPr>
+          <w:lang w:val="es-ES"/>
+        </w:rPr>
+        <w:t xml:space="preserve">) introdujo dificultades técnicas adicionales a la hora de sincronizar dependencias con Gradle, que tuvieron que resolverse manualmente. Ambos factores se han tenido en cuenta a la hora de </w:t>
+      </w:r>
+      <w:r>
+        <w:rPr>
+          <w:lang w:val="es-ES"/>
+        </w:rPr>
+        <w:t xml:space="preserve">planificar </w:t>
+      </w:r>
+      <w:r>
+        <w:rPr>
+          <w:lang w:val="es-ES"/>
+        </w:rPr>
+        <w:t xml:space="preserve">los </w:t>
+      </w:r>
+      <w:proofErr w:type="spellStart"/>
+      <w:r>
+        <w:rPr>
+          <w:lang w:val="es-ES"/>
+        </w:rPr>
+        <w:t>sprints</w:t>
+      </w:r>
+      <w:proofErr w:type="spellEnd"/>
+      <w:r>
+        <w:rPr>
+          <w:lang w:val="es-ES"/>
+        </w:rPr>
+        <w:t xml:space="preserve"> y priorizar las funcionalidades del MVP</w:t>
+      </w:r>
+      <w:r>
+        <w:rPr>
+          <w:lang w:val="es-ES"/>
+        </w:rPr>
+        <w:t xml:space="preserve"> evitando caer en numerosas ocasiones en tareas ajenas a las necesarias para el MVP </w:t>
+      </w:r>
+      <w:r>
+        <w:rPr>
+          <w:lang w:val="es-ES"/>
+        </w:rPr>
+        <w:t>llamados ”</w:t>
+      </w:r>
+      <w:proofErr w:type="spellStart"/>
+      <w:r>
+        <w:rPr>
+          <w:lang w:val="es-ES"/>
+        </w:rPr>
+        <w:t>rabbit</w:t>
+      </w:r>
+      <w:proofErr w:type="spellEnd"/>
+      <w:r>
+        <w:rPr>
+          <w:i/>
+          <w:iCs/>
+          <w:lang w:val="es-ES"/>
+        </w:rPr>
+        <w:t xml:space="preserve"> </w:t>
+      </w:r>
+      <w:proofErr w:type="spellStart"/>
+      <w:r>
+        <w:rPr>
+          <w:i/>
+          <w:iCs/>
+          <w:lang w:val="es-ES"/>
+        </w:rPr>
+        <w:t>holes</w:t>
+      </w:r>
+      <w:proofErr w:type="spellEnd"/>
+      <w:r>
+        <w:rPr>
+          <w:i/>
+          <w:iCs/>
+          <w:lang w:val="es-ES"/>
+        </w:rPr>
+        <w:t>”</w:t>
+      </w:r>
+      <w:r>
+        <w:rPr>
+          <w:lang w:val="es-ES"/>
+        </w:rPr>
+        <w:t>.</w:t>
+      </w:r>
+    </w:p>
+    <w:p>
+      <w:pPr>
+        <w:rPr>
+          <w:b/>
+          <w:bCs/>
+          <w:lang w:val="es-ES"/>
+        </w:rPr>
+      </w:pPr>
+      <w:r>
+        <w:rPr>
+          <w:b/>
+          <w:bCs/>
+          <w:lang w:val="es-ES"/>
+        </w:rPr>
+        <w:t xml:space="preserve">Planificación: </w:t>
+      </w:r>
+      <w:r>
+        <w:rPr>
+          <w:b/>
+          <w:bCs/>
+        </w:rPr>
+        <w:t>estimación vs. realidad</w:t>
+      </w:r>
+    </w:p>
+    <w:p>
+      <w:pPr>
+        <w:rPr>
+          <w:lang w:val="es-ES"/>
+        </w:rPr>
+      </w:pPr>
+      <w:r>
+        <w:t xml:space="preserve">La planificación inicial contemplaba </w:t>
+      </w:r>
+      <w:proofErr w:type="spellStart"/>
+      <w:r>
+        <w:t>sprints</w:t>
+      </w:r>
+      <w:proofErr w:type="spellEnd"/>
+      <w:r>
+        <w:t xml:space="preserve"> semanales de duración uniforme. En la práctica, la duración real de cada sprint varió en función de la complejidad de las tareas y de la disponibilidad de tiempo. A continuación se muestra la tabla de planificación con las fechas reales extraídas del historial de Git del proyecto:</w:t>
       </w:r>
     </w:p>
     <w:p>
@@ -8608,16 +8853,8 @@
         <w:rPr>
           <w:lang w:val="es-ES"/>
         </w:rPr>
-        <w:t xml:space="preserve"> “prioridad</w:t>
-      </w:r>
-      <w:proofErr w:type="gramStart"/>
-      <w:r>
-        <w:rPr>
-          <w:lang w:val="es-ES"/>
-        </w:rPr>
-        <w:t>”?*</w:t>
-      </w:r>
-      <w:proofErr w:type="gramEnd"/>
+        <w:t xml:space="preserve"> “prioridad”?*</w:t>
+      </w:r>
       <w:r>
         <w:rPr>
           <w:lang w:val="es-ES"/>
@@ -12828,7 +13065,6 @@
   <w:style w:type="character" w:default="1" w:styleId="Fuentedeprrafopredeter">
     <w:name w:val="Default Paragraph Font"/>
     <w:uiPriority w:val="1"/>
-    <w:semiHidden/>
     <w:unhideWhenUsed/>
   </w:style>
   <w:style w:type="table" w:default="1" w:styleId="Tablanormal">
@@ -13381,28 +13617,28 @@
 </file>
 
 <file path=customXml/item1.xml><?xml version="1.0" encoding="utf-8"?>
-<b:Sources xmlns:b="http://schemas.openxmlformats.org/officeDocument/2006/bibliography" xmlns="http://schemas.openxmlformats.org/officeDocument/2006/bibliography" SelectedStyle="\APASixthEditionOfficeOnline.xsl" StyleName="APA" Version="6"/>
-</file>
-
-<file path=customXml/item2.xml><?xml version="1.0" encoding="utf-8"?>
 <go:gDocsCustomXmlDataStorage xmlns:go="http://customooxmlschemas.google.com/" xmlns:r="http://schemas.openxmlformats.org/officeDocument/2006/relationships" uri="GoogleDocsCustomDataVersion2">
   <go:docsCustomData xmlns:go="http://customooxmlschemas.google.com/" roundtripDataSignature="AMtx7mjtTp76A7XcfsA3e8mJS6BPWqp4rA==">CgMxLjAyCGguZ2pkZ3hzMgloLjMwajB6bGwyCWguMWZvYjl0ZTIJaC4zem55c2g3MgloLjJldDkycDAyCGgudHlqY3d0MgloLjNkeTZ2a20yCWguMXQzaDVzZjIJaC40ZDM0b2c4MgloLjJzOGV5bzEyCWguMTdkcDh2dTIJaC4zcmRjcmpuMgloLjI2aW4xcmcyCGgubG54Yno5MgloLjM1bmt1bjIyCWguMWtzdjR1djIJaC40NHNpbmlvMgloLjJqeHN4cWgyCGguejMzN3lhMgloLjNqMnFxbTM4AHIhMW5lMFliWWRuQ3k4bG9vUWRRN2RCbXdrWjQzTkRTd0JD</go:docsCustomData>
 </go:gDocsCustomXmlDataStorage>
 </file>
 
-<file path=customXml/itemProps1.xml><?xml version="1.0" encoding="utf-8"?>
-<ds:datastoreItem xmlns:ds="http://schemas.openxmlformats.org/officeDocument/2006/customXml" ds:itemID="{E66D56AF-1747-4E2C-9179-14FD0640A7CF}">
-  <ds:schemaRefs>
-    <ds:schemaRef ds:uri="http://schemas.openxmlformats.org/officeDocument/2006/bibliography"/>
-  </ds:schemaRefs>
-</ds:datastoreItem>
+<file path=customXml/item2.xml><?xml version="1.0" encoding="utf-8"?>
+<b:Sources xmlns:b="http://schemas.openxmlformats.org/officeDocument/2006/bibliography" xmlns="http://schemas.openxmlformats.org/officeDocument/2006/bibliography" SelectedStyle="\APASixthEditionOfficeOnline.xsl" StyleName="APA" Version="6"/>
 </file>
 
-<file path=customXml/itemProps2.xml><?xml version="1.0" encoding="utf-8"?>
+<file path=customXml/itemProps1.xml><?xml version="1.0" encoding="utf-8"?>
 <ds:datastoreItem xmlns:ds="http://schemas.openxmlformats.org/officeDocument/2006/customXml" ds:itemID="{11111111-1234-1234-1234-123412341234}">
   <ds:schemaRefs>
     <ds:schemaRef ds:uri="http://customooxmlschemas.google.com/"/>
     <ds:schemaRef ds:uri="http://schemas.openxmlformats.org/officeDocument/2006/relationships"/>
   </ds:schemaRefs>
 </ds:datastoreItem>
+</file>
+
+<file path=customXml/itemProps2.xml><?xml version="1.0" encoding="utf-8"?>
+<ds:datastoreItem xmlns:ds="http://schemas.openxmlformats.org/officeDocument/2006/customXml" ds:itemID="{E66D56AF-1747-4E2C-9179-14FD0640A7CF}">
+  <ds:schemaRefs>
+    <ds:schemaRef ds:uri="http://schemas.openxmlformats.org/officeDocument/2006/bibliography"/>
+  </ds:schemaRefs>
+</ds:datastoreItem>
 </file>
</xml_diff>